<commit_message>
CRUD functionality is working
</commit_message>
<xml_diff>
--- a/Works Order System - Design.docx
+++ b/Works Order System - Design.docx
@@ -218,29 +218,38 @@
         <w:rPr>
           <w:lang w:val="en-US"/>
         </w:rPr>
-        <w:t>*CRUD</w:t>
-      </w:r>
-    </w:p>
-    <w:p>
-      <w:pPr>
-        <w:rPr>
-          <w:lang w:val="en-US"/>
-        </w:rPr>
-      </w:pPr>
-      <w:r>
-        <w:rPr>
-          <w:lang w:val="en-US"/>
-        </w:rPr>
         <w:t>*</w:t>
       </w:r>
       <w:r>
         <w:rPr>
+          <w:strike/>
+          <w:lang w:val="en-US"/>
+        </w:rPr>
+        <w:t>CRUD</w:t>
+      </w:r>
+    </w:p>
+    <w:p>
+      <w:pPr>
+        <w:rPr>
+          <w:lang w:val="en-US"/>
+        </w:rPr>
+      </w:pPr>
+      <w:r>
+        <w:rPr>
+          <w:lang w:val="en-US"/>
+        </w:rPr>
+        <w:t>*</w:t>
+      </w:r>
+      <w:r>
+        <w:rPr>
+          <w:strike/>
           <w:lang w:val="en-US"/>
         </w:rPr>
         <w:t xml:space="preserve">Centralized </w:t>
       </w:r>
       <w:r>
         <w:rPr>
+          <w:strike/>
           <w:lang w:val="en-US"/>
         </w:rPr>
         <w:t>DB Storage</w:t>
@@ -256,66 +265,92 @@
         <w:rPr>
           <w:lang w:val="en-US"/>
         </w:rPr>
-        <w:t>FUTURE Capabilities</w:t>
-      </w:r>
-    </w:p>
-    <w:p>
-      <w:pPr>
-        <w:rPr>
-          <w:lang w:val="en-US"/>
-        </w:rPr>
-      </w:pPr>
-      <w:r>
-        <w:rPr>
-          <w:lang w:val="en-US"/>
-        </w:rPr>
-        <w:t>*</w:t>
-      </w:r>
-      <w:r>
-        <w:rPr>
-          <w:lang w:val="en-US"/>
-        </w:rPr>
-        <w:t>Decent</w:t>
-      </w:r>
-      <w:r>
-        <w:rPr>
-          <w:lang w:val="en-US"/>
-        </w:rPr>
-        <w:t>r</w:t>
-      </w:r>
-      <w:r>
-        <w:rPr>
-          <w:lang w:val="en-US"/>
-        </w:rPr>
-        <w:t>a</w:t>
-      </w:r>
-      <w:r>
-        <w:rPr>
-          <w:lang w:val="en-US"/>
-        </w:rPr>
-        <w:t xml:space="preserve">lized DB storage //Online Backup </w:t>
-      </w:r>
-    </w:p>
-    <w:p>
-      <w:pPr>
-        <w:rPr>
-          <w:lang w:val="en-US"/>
-        </w:rPr>
-      </w:pPr>
-      <w:r>
-        <w:rPr>
-          <w:lang w:val="en-US"/>
-        </w:rPr>
-        <w:t>*Authen</w:t>
-      </w:r>
-      <w:r>
-        <w:rPr>
-          <w:lang w:val="en-US"/>
-        </w:rPr>
-        <w:t>t</w:t>
+        <w:t>*Generate reports preferably weekly &amp; monthly</w:t>
+      </w:r>
+    </w:p>
+    <w:p>
+      <w:pPr>
+        <w:rPr>
+          <w:lang w:val="en-US"/>
+        </w:rPr>
+      </w:pPr>
+      <w:r>
+        <w:rPr>
+          <w:lang w:val="en-US"/>
+        </w:rPr>
+        <w:t>*Authentication</w:t>
       </w:r>
       <w:bookmarkStart w:id="0" w:name="_GoBack"/>
       <w:bookmarkEnd w:id="0"/>
+    </w:p>
+    <w:p>
+      <w:pPr>
+        <w:rPr>
+          <w:lang w:val="en-US"/>
+        </w:rPr>
+      </w:pPr>
+      <w:r>
+        <w:rPr>
+          <w:lang w:val="en-US"/>
+        </w:rPr>
+        <w:t>FUTURE Capabilities</w:t>
+      </w:r>
+    </w:p>
+    <w:p>
+      <w:pPr>
+        <w:rPr>
+          <w:lang w:val="en-US"/>
+        </w:rPr>
+      </w:pPr>
+      <w:r>
+        <w:rPr>
+          <w:lang w:val="en-US"/>
+        </w:rPr>
+        <w:t>*</w:t>
+      </w:r>
+      <w:r>
+        <w:rPr>
+          <w:lang w:val="en-US"/>
+        </w:rPr>
+        <w:t>Decent</w:t>
+      </w:r>
+      <w:r>
+        <w:rPr>
+          <w:lang w:val="en-US"/>
+        </w:rPr>
+        <w:t>r</w:t>
+      </w:r>
+      <w:r>
+        <w:rPr>
+          <w:lang w:val="en-US"/>
+        </w:rPr>
+        <w:t>a</w:t>
+      </w:r>
+      <w:r>
+        <w:rPr>
+          <w:lang w:val="en-US"/>
+        </w:rPr>
+        <w:t xml:space="preserve">lized DB storage //Online Backup </w:t>
+      </w:r>
+    </w:p>
+    <w:p>
+      <w:pPr>
+        <w:rPr>
+          <w:lang w:val="en-US"/>
+        </w:rPr>
+      </w:pPr>
+      <w:r>
+        <w:rPr>
+          <w:lang w:val="en-US"/>
+        </w:rPr>
+        <w:t>*Authen</w:t>
+      </w:r>
+      <w:r>
+        <w:rPr>
+          <w:lang w:val="en-US"/>
+        </w:rPr>
+        <w:t>t</w:t>
+      </w:r>
       <w:r>
         <w:rPr>
           <w:lang w:val="en-US"/>
@@ -334,6 +369,25 @@
           <w:lang w:val="en-US"/>
         </w:rPr>
         <w:t>*Data science features //new ways to interpret data perhaps more input will be needed.</w:t>
+      </w:r>
+    </w:p>
+    <w:p>
+      <w:pPr>
+        <w:rPr>
+          <w:lang w:val="en-US"/>
+        </w:rPr>
+      </w:pPr>
+      <w:r>
+        <w:rPr>
+          <w:lang w:val="en-US"/>
+        </w:rPr>
+        <w:t>*System integrity will be discussed, I propose a two-factor system of artisan and writer.</w:t>
+      </w:r>
+      <w:r>
+        <w:rPr>
+          <w:lang w:val="en-US"/>
+        </w:rPr>
+        <w:t xml:space="preserve"> A verification from the user will ensure integrity, though this is also done by through signature.</w:t>
       </w:r>
     </w:p>
     <w:p>

</xml_diff>

<commit_message>
Created basic operational page
</commit_message>
<xml_diff>
--- a/Works Order System - Design.docx
+++ b/Works Order System - Design.docx
@@ -278,13 +278,57 @@
         <w:rPr>
           <w:lang w:val="en-US"/>
         </w:rPr>
-        <w:t>*Authentication</w:t>
+        <w:t>*</w:t>
+      </w:r>
+      <w:r>
+        <w:rPr>
+          <w:lang w:val="en-US"/>
+        </w:rPr>
+        <w:t>*</w:t>
+      </w:r>
+      <w:r>
+        <w:rPr>
+          <w:lang w:val="en-US"/>
+        </w:rPr>
+        <w:t>Authentication</w:t>
       </w:r>
       <w:r>
         <w:rPr>
           <w:lang w:val="en-US"/>
         </w:rPr>
         <w:t xml:space="preserve"> (Login capabilities)</w:t>
+      </w:r>
+      <w:r>
+        <w:rPr>
+          <w:lang w:val="en-US"/>
+        </w:rPr>
+        <w:t xml:space="preserve"> //Very basic at the moment but operable.</w:t>
+      </w:r>
+    </w:p>
+    <w:p>
+      <w:pPr>
+        <w:rPr>
+          <w:lang w:val="en-US"/>
+        </w:rPr>
+      </w:pPr>
+      <w:r>
+        <w:rPr>
+          <w:lang w:val="en-US"/>
+        </w:rPr>
+        <w:t>FUTURE Capabilities</w:t>
+      </w:r>
+    </w:p>
+    <w:p>
+      <w:pPr>
+        <w:rPr>
+          <w:lang w:val="en-US"/>
+        </w:rPr>
+      </w:pPr>
+      <w:r>
+        <w:rPr>
+          <w:lang w:val="en-US"/>
+        </w:rPr>
+        <w:t>*A feature that allows user to attach a material request to an order, this will help in producing reports and data collection.</w:t>
       </w:r>
       <w:bookmarkStart w:id="0" w:name="_GoBack"/>
       <w:bookmarkEnd w:id="0"/>
@@ -299,19 +343,6 @@
         <w:rPr>
           <w:lang w:val="en-US"/>
         </w:rPr>
-        <w:t>FUTURE Capabilities</w:t>
-      </w:r>
-    </w:p>
-    <w:p>
-      <w:pPr>
-        <w:rPr>
-          <w:lang w:val="en-US"/>
-        </w:rPr>
-      </w:pPr>
-      <w:r>
-        <w:rPr>
-          <w:lang w:val="en-US"/>
-        </w:rPr>
         <w:t>*</w:t>
       </w:r>
       <w:r>
@@ -337,31 +368,6 @@
           <w:lang w:val="en-US"/>
         </w:rPr>
         <w:t xml:space="preserve">lized DB storage //Online Backup </w:t>
-      </w:r>
-    </w:p>
-    <w:p>
-      <w:pPr>
-        <w:rPr>
-          <w:lang w:val="en-US"/>
-        </w:rPr>
-      </w:pPr>
-      <w:r>
-        <w:rPr>
-          <w:lang w:val="en-US"/>
-        </w:rPr>
-        <w:t>*Authen</w:t>
-      </w:r>
-      <w:r>
-        <w:rPr>
-          <w:lang w:val="en-US"/>
-        </w:rPr>
-        <w:t>t</w:t>
-      </w:r>
-      <w:r>
-        <w:rPr>
-          <w:lang w:val="en-US"/>
-        </w:rPr>
-        <w:t>ication //To prevent data tampering and promote integrity.</w:t>
       </w:r>
     </w:p>
     <w:p>

</xml_diff>